<commit_message>
feat(jackett): add Jackett as reference-only submodule (BOB-019)
Per operator decision: Jackett/Jackett added as a shallow, reference-only
submodule at submodules/jackett (latest release v0.24.2027). Runtime still uses
lscr.io/linuxserver/jackett:latest — we do NOT build from source; this is for
source awareness / indexer-definition reference. SSH URL (Hard-Stop #2),
submodules/ layout (§11.4.28(C)). Tracker + research README updated.

Co-Authored-By: Claude Opus 4.8 <noreply@anthropic.com>
</commit_message>
<xml_diff>
--- a/docs/Fixed.docx
+++ b/docs/Fixed.docx
@@ -2,7 +2,7 @@
 <file path=word/document.xml><?xml version="1.0" encoding="utf-8"?>
 <w:document xmlns:w="http://schemas.openxmlformats.org/wordprocessingml/2006/main" xmlns:m="http://schemas.openxmlformats.org/officeDocument/2006/math" xmlns:r="http://schemas.openxmlformats.org/officeDocument/2006/relationships" xmlns:o="urn:schemas-microsoft-com:office:office" xmlns:v="urn:schemas-microsoft-com:vml" xmlns:w10="urn:schemas-microsoft-com:office:word" xmlns:a="http://schemas.openxmlformats.org/drawingml/2006/main" xmlns:pic="http://schemas.openxmlformats.org/drawingml/2006/picture" xmlns:wp="http://schemas.openxmlformats.org/drawingml/2006/wordprocessingDrawing">
   <w:body>
-    <w:bookmarkStart w:id="23" w:name="fixed-closed-workable-items"/>
+    <w:bookmarkStart w:id="24" w:name="fixed-closed-workable-items"/>
     <w:p>
       <w:pPr>
         <w:pStyle w:val="Heading1"/>
@@ -26,7 +26,7 @@
         <w:t xml:space="preserve"> </w:t>
       </w:r>
       <w:r>
-        <w:t xml:space="preserve">4</w:t>
+        <w:t xml:space="preserve">5</w:t>
       </w:r>
       <w:r>
         <w:t xml:space="preserve"> </w:t>
@@ -42,7 +42,7 @@
         <w:t xml:space="preserve"> </w:t>
       </w:r>
       <w:r>
-        <w:t xml:space="preserve">2026-06-06T19:00:00Z</w:t>
+        <w:t xml:space="preserve">2026-06-06T19:20:00Z</w:t>
       </w:r>
       <w:r>
         <w:t xml:space="preserve"> </w:t>
@@ -2725,12 +2725,166 @@
       </w:r>
     </w:p>
     <w:bookmarkEnd w:id="21"/>
-    <w:bookmarkStart w:id="22" w:name="X47c449c7f5721f8e82e9f5c3332d9b0867976de"/>
+    <w:bookmarkStart w:id="22" w:name="X7bc1a5b1cd69f0ee6986d58bfd1635836a1a39f"/>
     <w:p>
       <w:pPr>
         <w:pStyle w:val="Heading2"/>
       </w:pPr>
       <w:r>
+        <w:t xml:space="preserve">§14. [BOB-019] Jackett added as a reference submodule (latest release)</w:t>
+      </w:r>
+    </w:p>
+    <w:p>
+      <w:pPr>
+        <w:pStyle w:val="FirstParagraph"/>
+      </w:pPr>
+      <w:r>
+        <w:rPr>
+          <w:b/>
+          <w:bCs/>
+        </w:rPr>
+        <w:t xml:space="preserve">Status:</w:t>
+      </w:r>
+      <w:r>
+        <w:t xml:space="preserve"> </w:t>
+      </w:r>
+      <w:r>
+        <w:t xml:space="preserve">Completed (→ Fixed.md)</w:t>
+      </w:r>
+      <w:r>
+        <w:t xml:space="preserve"> </w:t>
+      </w:r>
+      <w:r>
+        <w:rPr>
+          <w:b/>
+          <w:bCs/>
+        </w:rPr>
+        <w:t xml:space="preserve">Type:</w:t>
+      </w:r>
+      <w:r>
+        <w:t xml:space="preserve"> </w:t>
+      </w:r>
+      <w:r>
+        <w:t xml:space="preserve">Task</w:t>
+      </w:r>
+      <w:r>
+        <w:t xml:space="preserve"> </w:t>
+      </w:r>
+      <w:r>
+        <w:rPr>
+          <w:b/>
+          <w:bCs/>
+        </w:rPr>
+        <w:t xml:space="preserve">Closed:</w:t>
+      </w:r>
+      <w:r>
+        <w:t xml:space="preserve"> </w:t>
+      </w:r>
+      <w:r>
+        <w:t xml:space="preserve">2026-06-06</w:t>
+      </w:r>
+    </w:p>
+    <w:p>
+      <w:pPr>
+        <w:pStyle w:val="BodyText"/>
+      </w:pPr>
+      <w:r>
+        <w:t xml:space="preserve">Per operator decision,</w:t>
+      </w:r>
+      <w:r>
+        <w:t xml:space="preserve"> </w:t>
+      </w:r>
+      <w:r>
+        <w:rPr>
+          <w:rStyle w:val="VerbatimChar"/>
+        </w:rPr>
+        <w:t xml:space="preserve">git@github.com:Jackett/Jackett.git</w:t>
+      </w:r>
+      <w:r>
+        <w:t xml:space="preserve"> </w:t>
+      </w:r>
+      <w:r>
+        <w:t xml:space="preserve">is added as a</w:t>
+      </w:r>
+      <w:r>
+        <w:t xml:space="preserve"> </w:t>
+      </w:r>
+      <w:r>
+        <w:rPr>
+          <w:b/>
+          <w:bCs/>
+        </w:rPr>
+        <w:t xml:space="preserve">reference-only</w:t>
+      </w:r>
+      <w:r>
+        <w:t xml:space="preserve"> </w:t>
+      </w:r>
+      <w:r>
+        <w:t xml:space="preserve">git submodule at</w:t>
+      </w:r>
+      <w:r>
+        <w:t xml:space="preserve"> </w:t>
+      </w:r>
+      <w:r>
+        <w:rPr>
+          <w:rStyle w:val="VerbatimChar"/>
+        </w:rPr>
+        <w:t xml:space="preserve">submodules/jackett</w:t>
+      </w:r>
+      <w:r>
+        <w:t xml:space="preserve"> </w:t>
+      </w:r>
+      <w:r>
+        <w:t xml:space="preserve">(latest release</w:t>
+      </w:r>
+      <w:r>
+        <w:t xml:space="preserve"> </w:t>
+      </w:r>
+      <w:r>
+        <w:rPr>
+          <w:b/>
+          <w:bCs/>
+        </w:rPr>
+        <w:t xml:space="preserve">v0.24.2027</w:t>
+      </w:r>
+      <w:r>
+        <w:t xml:space="preserve">, shallow). Runtime still uses the maintained linuxserver image;</w:t>
+      </w:r>
+      <w:r>
+        <w:t xml:space="preserve"> </w:t>
+      </w:r>
+      <w:r>
+        <w:t xml:space="preserve">we do NOT build Jackett from source. Provides source awareness for inspecting /</w:t>
+      </w:r>
+      <w:r>
+        <w:t xml:space="preserve"> </w:t>
+      </w:r>
+      <w:r>
+        <w:t xml:space="preserve">cherry-picking indexer definitions. SSH URL per Hard-Stop #2; placed under</w:t>
+      </w:r>
+      <w:r>
+        <w:t xml:space="preserve"> </w:t>
+      </w:r>
+      <w:r>
+        <w:rPr>
+          <w:rStyle w:val="VerbatimChar"/>
+        </w:rPr>
+        <w:t xml:space="preserve">submodules/</w:t>
+      </w:r>
+      <w:r>
+        <w:t xml:space="preserve"> </w:t>
+      </w:r>
+      <w:r>
+        <w:t xml:space="preserve">per §11.4.28(C).</w:t>
+      </w:r>
+    </w:p>
+    <w:bookmarkEnd w:id="22"/>
+    <w:bookmarkStart w:id="23" w:name="X47c449c7f5721f8e82e9f5c3332d9b0867976de"/>
+    <w:p>
+      <w:pPr>
+        <w:pStyle w:val="Heading2"/>
+      </w:pPr>
+      <w:r>
         <w:t xml:space="preserve">§6. [BOB-014] Go</w:t>
       </w:r>
       <w:r>
@@ -2932,8 +3086,8 @@
         <w:t xml:space="preserve">green, deterministic.</w:t>
       </w:r>
     </w:p>
-    <w:bookmarkEnd w:id="22"/>
     <w:bookmarkEnd w:id="23"/>
+    <w:bookmarkEnd w:id="24"/>
     <w:sectPr>
       <w:footnotePr>
         <w:numRestart w:val="eachSect"/>

</xml_diff>

<commit_message>
docs(tracker): record BOB-020 CodeGraph; backfill BOB-019 hash; rev 6
Co-Authored-By: Claude Opus 4.8 <noreply@anthropic.com>
</commit_message>
<xml_diff>
--- a/docs/Fixed.docx
+++ b/docs/Fixed.docx
@@ -2,7 +2,7 @@
 <file path=word/document.xml><?xml version="1.0" encoding="utf-8"?>
 <w:document xmlns:w="http://schemas.openxmlformats.org/wordprocessingml/2006/main" xmlns:m="http://schemas.openxmlformats.org/officeDocument/2006/math" xmlns:r="http://schemas.openxmlformats.org/officeDocument/2006/relationships" xmlns:o="urn:schemas-microsoft-com:office:office" xmlns:v="urn:schemas-microsoft-com:vml" xmlns:w10="urn:schemas-microsoft-com:office:word" xmlns:a="http://schemas.openxmlformats.org/drawingml/2006/main" xmlns:pic="http://schemas.openxmlformats.org/drawingml/2006/picture" xmlns:wp="http://schemas.openxmlformats.org/drawingml/2006/wordprocessingDrawing">
   <w:body>
-    <w:bookmarkStart w:id="24" w:name="fixed-closed-workable-items"/>
+    <w:bookmarkStart w:id="25" w:name="fixed-closed-workable-items"/>
     <w:p>
       <w:pPr>
         <w:pStyle w:val="Heading1"/>
@@ -26,7 +26,7 @@
         <w:t xml:space="preserve"> </w:t>
       </w:r>
       <w:r>
-        <w:t xml:space="preserve">5</w:t>
+        <w:t xml:space="preserve">6</w:t>
       </w:r>
       <w:r>
         <w:t xml:space="preserve"> </w:t>
@@ -42,7 +42,7 @@
         <w:t xml:space="preserve"> </w:t>
       </w:r>
       <w:r>
-        <w:t xml:space="preserve">2026-06-06T19:20:00Z</w:t>
+        <w:t xml:space="preserve">2026-06-06T19:45:00Z</w:t>
       </w:r>
       <w:r>
         <w:t xml:space="preserve"> </w:t>
@@ -2879,12 +2879,280 @@
       </w:r>
     </w:p>
     <w:bookmarkEnd w:id="22"/>
-    <w:bookmarkStart w:id="23" w:name="X47c449c7f5721f8e82e9f5c3332d9b0867976de"/>
+    <w:bookmarkStart w:id="23" w:name="X6bbb215a7cfe4e194c0c96560c35eed2121358b"/>
     <w:p>
       <w:pPr>
         <w:pStyle w:val="Heading2"/>
       </w:pPr>
       <w:r>
+        <w:t xml:space="preserve">§15. [BOB-020] CodeGraph initialized + wired (§11.4.78/79/80)</w:t>
+      </w:r>
+    </w:p>
+    <w:p>
+      <w:pPr>
+        <w:pStyle w:val="FirstParagraph"/>
+      </w:pPr>
+      <w:r>
+        <w:rPr>
+          <w:b/>
+          <w:bCs/>
+        </w:rPr>
+        <w:t xml:space="preserve">Status:</w:t>
+      </w:r>
+      <w:r>
+        <w:t xml:space="preserve"> </w:t>
+      </w:r>
+      <w:r>
+        <w:t xml:space="preserve">Completed (→ Fixed.md)</w:t>
+      </w:r>
+      <w:r>
+        <w:t xml:space="preserve"> </w:t>
+      </w:r>
+      <w:r>
+        <w:rPr>
+          <w:b/>
+          <w:bCs/>
+        </w:rPr>
+        <w:t xml:space="preserve">Type:</w:t>
+      </w:r>
+      <w:r>
+        <w:t xml:space="preserve"> </w:t>
+      </w:r>
+      <w:r>
+        <w:t xml:space="preserve">Task</w:t>
+      </w:r>
+      <w:r>
+        <w:t xml:space="preserve"> </w:t>
+      </w:r>
+      <w:r>
+        <w:rPr>
+          <w:b/>
+          <w:bCs/>
+        </w:rPr>
+        <w:t xml:space="preserve">Closed:</w:t>
+      </w:r>
+      <w:r>
+        <w:t xml:space="preserve"> </w:t>
+      </w:r>
+      <w:r>
+        <w:t xml:space="preserve">2026-06-06 ·</w:t>
+      </w:r>
+      <w:r>
+        <w:t xml:space="preserve"> </w:t>
+      </w:r>
+      <w:r>
+        <w:rPr>
+          <w:b/>
+          <w:bCs/>
+        </w:rPr>
+        <w:t xml:space="preserve">Commit:</w:t>
+      </w:r>
+      <w:r>
+        <w:t xml:space="preserve"> </w:t>
+      </w:r>
+      <w:r>
+        <w:rPr>
+          <w:rStyle w:val="VerbatimChar"/>
+        </w:rPr>
+        <w:t xml:space="preserve">f9a277b</w:t>
+      </w:r>
+    </w:p>
+    <w:p>
+      <w:pPr>
+        <w:pStyle w:val="BodyText"/>
+      </w:pPr>
+      <w:r>
+        <w:t xml:space="preserve">CodeGraph 0.9.9 installed (npm, no sudo), project indexed (509 files / 8906</w:t>
+      </w:r>
+      <w:r>
+        <w:t xml:space="preserve"> </w:t>
+      </w:r>
+      <w:r>
+        <w:t xml:space="preserve">nodes / 17025 edges), wired as a project-scoped MCP server in</w:t>
+      </w:r>
+      <w:r>
+        <w:t xml:space="preserve"> </w:t>
+      </w:r>
+      <w:r>
+        <w:rPr>
+          <w:rStyle w:val="VerbatimChar"/>
+        </w:rPr>
+        <w:t xml:space="preserve">.mcp.json</w:t>
+      </w:r>
+      <w:r>
+        <w:t xml:space="preserve">.</w:t>
+      </w:r>
+      <w:r>
+        <w:t xml:space="preserve"> </w:t>
+      </w:r>
+      <w:r>
+        <w:t xml:space="preserve">Exclusions via</w:t>
+      </w:r>
+      <w:r>
+        <w:t xml:space="preserve"> </w:t>
+      </w:r>
+      <w:r>
+        <w:rPr>
+          <w:rStyle w:val="VerbatimChar"/>
+        </w:rPr>
+        <w:t xml:space="preserve">.gitignore</w:t>
+      </w:r>
+      <w:r>
+        <w:t xml:space="preserve"> </w:t>
+      </w:r>
+      <w:r>
+        <w:t xml:space="preserve">(v0.9.9 is zero-config): 0 secret/credential paths,</w:t>
+      </w:r>
+      <w:r>
+        <w:t xml:space="preserve"> </w:t>
+      </w:r>
+      <w:r>
+        <w:t xml:space="preserve">0 third-party</w:t>
+      </w:r>
+      <w:r>
+        <w:t xml:space="preserve"> </w:t>
+      </w:r>
+      <w:r>
+        <w:rPr>
+          <w:rStyle w:val="VerbatimChar"/>
+        </w:rPr>
+        <w:t xml:space="preserve">submodules/jackett</w:t>
+      </w:r>
+      <w:r>
+        <w:t xml:space="preserve"> </w:t>
+      </w:r>
+      <w:r>
+        <w:t xml:space="preserve">paths;</w:t>
+      </w:r>
+      <w:r>
+        <w:t xml:space="preserve"> </w:t>
+      </w:r>
+      <w:r>
+        <w:rPr>
+          <w:rStyle w:val="VerbatimChar"/>
+        </w:rPr>
+        <w:t xml:space="preserve">constitution</w:t>
+      </w:r>
+      <w:r>
+        <w:t xml:space="preserve"> </w:t>
+      </w:r>
+      <w:r>
+        <w:t xml:space="preserve">(own-org) included.</w:t>
+      </w:r>
+      <w:r>
+        <w:t xml:space="preserve"> </w:t>
+      </w:r>
+      <w:r>
+        <w:rPr>
+          <w:rStyle w:val="VerbatimChar"/>
+        </w:rPr>
+        <w:t xml:space="preserve">.codegraph/codegraph.db</w:t>
+      </w:r>
+      <w:r>
+        <w:t xml:space="preserve"> </w:t>
+      </w:r>
+      <w:r>
+        <w:t xml:space="preserve">gitignored (regen:</w:t>
+      </w:r>
+      <w:r>
+        <w:t xml:space="preserve"> </w:t>
+      </w:r>
+      <w:r>
+        <w:rPr>
+          <w:rStyle w:val="VerbatimChar"/>
+        </w:rPr>
+        <w:t xml:space="preserve">codegraph index</w:t>
+      </w:r>
+      <w:r>
+        <w:t xml:space="preserve">, §11.4.77).</w:t>
+      </w:r>
+      <w:r>
+        <w:t xml:space="preserve"> </w:t>
+      </w:r>
+      <w:r>
+        <w:rPr>
+          <w:b/>
+          <w:bCs/>
+        </w:rPr>
+        <w:t xml:space="preserve">Evidence:</w:t>
+      </w:r>
+      <w:r>
+        <w:t xml:space="preserve"> </w:t>
+      </w:r>
+      <w:r>
+        <w:rPr>
+          <w:rStyle w:val="VerbatimChar"/>
+        </w:rPr>
+        <w:t xml:space="preserve">scripts/codegraph_validate.sh</w:t>
+      </w:r>
+      <w:r>
+        <w:t xml:space="preserve"> </w:t>
+      </w:r>
+      <w:r>
+        <w:t xml:space="preserve">7 PASS/0 FAIL incl. the unforgeable</w:t>
+      </w:r>
+      <w:r>
+        <w:t xml:space="preserve"> </w:t>
+      </w:r>
+      <w:r>
+        <w:t xml:space="preserve">MCP challenge (MCP</w:t>
+      </w:r>
+      <w:r>
+        <w:t xml:space="preserve"> </w:t>
+      </w:r>
+      <w:r>
+        <w:rPr>
+          <w:rStyle w:val="VerbatimChar"/>
+        </w:rPr>
+        <w:t xml:space="preserve">codegraph_status</w:t>
+      </w:r>
+      <w:r>
+        <w:t xml:space="preserve"> </w:t>
+      </w:r>
+      <w:r>
+        <w:t xml:space="preserve">node count == CLI, both 8906);</w:t>
+      </w:r>
+      <w:r>
+        <w:t xml:space="preserve"> </w:t>
+      </w:r>
+      <w:r>
+        <w:t xml:space="preserve">independently re-verified by the conductor. Docs:</w:t>
+      </w:r>
+      <w:r>
+        <w:t xml:space="preserve"> </w:t>
+      </w:r>
+      <w:r>
+        <w:rPr>
+          <w:rStyle w:val="VerbatimChar"/>
+        </w:rPr>
+        <w:t xml:space="preserve">docs/CODEGRAPH.md</w:t>
+      </w:r>
+      <w:r>
+        <w:t xml:space="preserve"> </w:t>
+      </w:r>
+      <w:r>
+        <w:t xml:space="preserve">+</w:t>
+      </w:r>
+      <w:r>
+        <w:t xml:space="preserve"> </w:t>
+      </w:r>
+      <w:r>
+        <w:rPr>
+          <w:rStyle w:val="VerbatimChar"/>
+        </w:rPr>
+        <w:t xml:space="preserve">docs/codegraph/Status.md</w:t>
+      </w:r>
+      <w:r>
+        <w:t xml:space="preserve">.</w:t>
+      </w:r>
+    </w:p>
+    <w:bookmarkEnd w:id="23"/>
+    <w:bookmarkStart w:id="24" w:name="X47c449c7f5721f8e82e9f5c3332d9b0867976de"/>
+    <w:p>
+      <w:pPr>
+        <w:pStyle w:val="Heading2"/>
+      </w:pPr>
+      <w:r>
         <w:t xml:space="preserve">§6. [BOB-014] Go</w:t>
       </w:r>
       <w:r>
@@ -3086,8 +3354,8 @@
         <w:t xml:space="preserve">green, deterministic.</w:t>
       </w:r>
     </w:p>
-    <w:bookmarkEnd w:id="23"/>
     <w:bookmarkEnd w:id="24"/>
+    <w:bookmarkEnd w:id="25"/>
     <w:sectPr>
       <w:footnotePr>
         <w:numRestart w:val="eachSect"/>

</xml_diff>